<commit_message>
feat(conv): agregar convocatoria oficial Marruecos (26/05/2026) — 22/48
</commit_message>
<xml_diff>
--- a/DOCUMENTO RESUMEN ACTUALIZADO 26-05-2026.docx
+++ b/DOCUMENTO RESUMEN ACTUALIZADO 26-05-2026.docx
@@ -12128,6 +12128,113 @@
       <w:r>
         <w:rPr/>
         <w:t xml:space="preserve">feat(conv): agregar convocatoria oficial Colombia (25/05/2026)</w:t>
+      </w:r>
+    </w:p>
+    <w:p/>
+    <w:p>
+      <w:pPr>
+        <w:pStyle w:val="Heading1"/>
+      </w:pPr>
+      <w:r>
+        <w:t xml:space="preserve">SESION 26/05/2026 - CONVOCATORIA MARRUECOS</w:t>
+      </w:r>
+    </w:p>
+    <w:p/>
+    <w:p>
+      <w:r>
+        <w:rPr>
+          <w:b/>
+        </w:rPr>
+        <w:t xml:space="preserve">Lista oficial Marruecos - Convocatoria Mundial 2026</w:t>
+      </w:r>
+    </w:p>
+    <w:p>
+      <w:r>
+        <w:rPr>
+          <w:b/>
+        </w:rPr>
+        <w:t xml:space="preserve">26 jugadores confirmados el 26/05/2026</w:t>
+      </w:r>
+    </w:p>
+    <w:p/>
+    <w:p>
+      <w:r>
+        <w:rPr>
+          <w:b/>
+        </w:rPr>
+        <w:t xml:space="preserve">Arqueros (3):</w:t>
+      </w:r>
+    </w:p>
+    <w:p>
+      <w:r>
+        <w:rPr/>
+        <w:t xml:space="preserve">Yassine Bono (Al-Hilal SFC), Munir El Kajoui (RS Berkane), Ahmed Reda Tagnaouti (AS FAR).</w:t>
+      </w:r>
+    </w:p>
+    <w:p/>
+    <w:p>
+      <w:r>
+        <w:rPr>
+          <w:b/>
+        </w:rPr>
+        <w:t xml:space="preserve">Defensas (9):</w:t>
+      </w:r>
+    </w:p>
+    <w:p>
+      <w:r>
+        <w:rPr/>
+        <w:t xml:space="preserve">Achraf Hakimi (Paris Saint-Germain), Noussair Mazraoui (Manchester United), Anass Salah-Eddine (PSV Eindhoven), Nayef Aguerd (Olympique Marsella), Issa Diop (Fulham FC), Chadi Riad (Crystal Palace), Youssef Belammari (Al-Ahly SC), Redouane Halhal (KV Mechelen), Zakaria El Ouahdi (KRC Genk).</w:t>
+      </w:r>
+    </w:p>
+    <w:p/>
+    <w:p>
+      <w:r>
+        <w:rPr>
+          <w:b/>
+        </w:rPr>
+        <w:t xml:space="preserve">Mediocampistas (8):</w:t>
+      </w:r>
+    </w:p>
+    <w:p>
+      <w:r>
+        <w:rPr/>
+        <w:t xml:space="preserve">Azzedine Ounahi (Girona FC), Neil El Aynaoui (AS Roma), Sofyan Amrabat (Real Betis), Ayyoub Bouaddi (LOSC Lille), Samir El Mourabet (RC Estrasburgo), Bilal El Khannouss (VfB Stuttgart), Ismael Saibari (PSV Eindhoven), Brahim Diaz (Real Madrid CF).</w:t>
+      </w:r>
+    </w:p>
+    <w:p/>
+    <w:p>
+      <w:r>
+        <w:rPr>
+          <w:b/>
+        </w:rPr>
+        <w:t xml:space="preserve">Delanteros (6):</w:t>
+      </w:r>
+    </w:p>
+    <w:p>
+      <w:r>
+        <w:rPr/>
+        <w:t xml:space="preserve">Abde Ezzalzouli (Real Betis), Yassine Gessime (RC Estrasburgo), Chemsdine Talbi (AFC Sunderland), Soufiane Rahimi (Al-Ain FC), Ayoub El Kaabi (Olympiakos), Ayoub Amaimouni-Echghouyab (Eintracht Frankfurt).</w:t>
+      </w:r>
+    </w:p>
+    <w:p/>
+    <w:p>
+      <w:r>
+        <w:rPr>
+          <w:b/>
+        </w:rPr>
+        <w:t xml:space="preserve">Cambio en plataforma:</w:t>
+      </w:r>
+    </w:p>
+    <w:p>
+      <w:r>
+        <w:rPr/>
+        <w:t xml:space="preserve">Se agrego 'mar' a CONV_OFICIALES en admin/index.html (26/05/2026).</w:t>
+      </w:r>
+    </w:p>
+    <w:p>
+      <w:r>
+        <w:rPr/>
+        <w:t xml:space="preserve">Total convocatorias confirmadas al 26/05/2026: 22 de 48 equipos.</w:t>
       </w:r>
     </w:p>
     <w:p/>

</xml_diff>

<commit_message>
feat(conv): agregar convocatoria oficial Holanda (27/05/2026) — 23/48
</commit_message>
<xml_diff>
--- a/DOCUMENTO RESUMEN ACTUALIZADO 26-05-2026.docx
+++ b/DOCUMENTO RESUMEN ACTUALIZADO 26-05-2026.docx
@@ -12235,6 +12235,113 @@
       <w:r>
         <w:rPr/>
         <w:t xml:space="preserve">Total convocatorias confirmadas al 26/05/2026: 22 de 48 equipos.</w:t>
+      </w:r>
+    </w:p>
+    <w:p/>
+    <w:p>
+      <w:pPr>
+        <w:pStyle w:val="Heading1"/>
+      </w:pPr>
+      <w:r>
+        <w:t xml:space="preserve">SESION 27/05/2026 - CONVOCATORIA HOLANDA (PAISES BAJOS)</w:t>
+      </w:r>
+    </w:p>
+    <w:p/>
+    <w:p>
+      <w:r>
+        <w:rPr>
+          <w:b/>
+        </w:rPr>
+        <w:t xml:space="preserve">Lista oficial Paises Bajos - Convocatoria Mundial 2026</w:t>
+      </w:r>
+    </w:p>
+    <w:p>
+      <w:r>
+        <w:rPr>
+          <w:b/>
+        </w:rPr>
+        <w:t xml:space="preserve">26 jugadores confirmados el 27/05/2026</w:t>
+      </w:r>
+    </w:p>
+    <w:p/>
+    <w:p>
+      <w:r>
+        <w:rPr>
+          <w:b/>
+        </w:rPr>
+        <w:t xml:space="preserve">Arqueros (3):</w:t>
+      </w:r>
+    </w:p>
+    <w:p>
+      <w:r>
+        <w:rPr/>
+        <w:t xml:space="preserve">Bart Verbruggen (Brighton), Mark Flekken (Bayer Leverkusen), Robin Roefs (Sunderland).</w:t>
+      </w:r>
+    </w:p>
+    <w:p/>
+    <w:p>
+      <w:r>
+        <w:rPr>
+          <w:b/>
+        </w:rPr>
+        <w:t xml:space="preserve">Defensas (7):</w:t>
+      </w:r>
+    </w:p>
+    <w:p>
+      <w:r>
+        <w:rPr/>
+        <w:t xml:space="preserve">Virgil van Dijk (Liverpool), Nathan Ake (Manchester City), Denzel Dumfries (Inter), Micky van de Ven (Tottenham), Jurrien Timber (Arsenal), Jan Paul van Hecke (Brighton), Jorrel Hato (Chelsea).</w:t>
+      </w:r>
+    </w:p>
+    <w:p/>
+    <w:p>
+      <w:r>
+        <w:rPr>
+          <w:b/>
+        </w:rPr>
+        <w:t xml:space="preserve">Mediocampistas (8):</w:t>
+      </w:r>
+    </w:p>
+    <w:p>
+      <w:r>
+        <w:rPr/>
+        <w:t xml:space="preserve">Frenkie de Jong (Barcelona), Ryan Gravenberch (Liverpool), Teun Koopmeiners (Juventus), Tijjani Reijnders (Manchester City), Marten de Roon (Atalanta), Guus Til (PSV), Quinten Timber (Marsella), Mats Wieffer (Brighton).</w:t>
+      </w:r>
+    </w:p>
+    <w:p/>
+    <w:p>
+      <w:r>
+        <w:rPr>
+          <w:b/>
+        </w:rPr>
+        <w:t xml:space="preserve">Delanteros (8):</w:t>
+      </w:r>
+    </w:p>
+    <w:p>
+      <w:r>
+        <w:rPr/>
+        <w:t xml:space="preserve">Memphis Depay (Corinthians), Cody Gakpo (Liverpool), Donyell Malen (Roma), Brian Brobbey (Sunderland), Noa Lang (Galatasaray), Crysencio Summerville (West Ham), Wout Weghorst (Ajax), Justin Kluivert (Bournemouth).</w:t>
+      </w:r>
+    </w:p>
+    <w:p/>
+    <w:p>
+      <w:r>
+        <w:rPr>
+          <w:b/>
+        </w:rPr>
+        <w:t xml:space="preserve">Cambio en plataforma:</w:t>
+      </w:r>
+    </w:p>
+    <w:p>
+      <w:r>
+        <w:rPr/>
+        <w:t xml:space="preserve">Se agrego 'ned' a CONV_OFICIALES en admin/index.html (27/05/2026).</w:t>
+      </w:r>
+    </w:p>
+    <w:p>
+      <w:r>
+        <w:rPr/>
+        <w:t xml:space="preserve">Total convocatorias confirmadas al 27/05/2026: 23 de 48 equipos.</w:t>
       </w:r>
     </w:p>
     <w:p/>

</xml_diff>